<commit_message>
Correction erreur mise en page
</commit_message>
<xml_diff>
--- a/Cours/5eme/SaintExupery/Chapitre_17/Documents/Chapitre 17 - Solides - Polyèdres, Cône et Sphère (Complet).docx
+++ b/Cours/5eme/SaintExupery/Chapitre_17/Documents/Chapitre 17 - Solides - Polyèdres, Cône et Sphère (Complet).docx
@@ -1,6 +1,6 @@
 
 <file path=word/document.xml><?xml version="1.0" encoding="utf-8"?>
-<w:document xmlns:wpc="http://schemas.microsoft.com/office/word/2010/wordprocessingCanvas" xmlns:cx="http://schemas.microsoft.com/office/drawing/2014/chartex" xmlns:cx1="http://schemas.microsoft.com/office/drawing/2015/9/8/chartex" xmlns:cx2="http://schemas.microsoft.com/office/drawing/2015/10/21/chartex" xmlns:cx3="http://schemas.microsoft.com/office/drawing/2016/5/9/chartex" xmlns:cx4="http://schemas.microsoft.com/office/drawing/2016/5/10/chartex" xmlns:cx5="http://schemas.microsoft.com/office/drawing/2016/5/11/chartex" xmlns:cx6="http://schemas.microsoft.com/office/drawing/2016/5/12/chartex" xmlns:cx7="http://schemas.microsoft.com/office/drawing/2016/5/13/chartex" xmlns:cx8="http://schemas.microsoft.com/office/drawing/2016/5/14/chartex" xmlns:mc="http://schemas.openxmlformats.org/markup-compatibility/2006" xmlns:aink="http://schemas.microsoft.com/office/drawing/2016/ink" xmlns:am3d="http://schemas.microsoft.com/office/drawing/2017/model3d" xmlns:o="urn:schemas-microsoft-com:office:office" xmlns:r="http://schemas.openxmlformats.org/officeDocument/2006/relationships" xmlns:m="http://schemas.openxmlformats.org/officeDocument/2006/math" xmlns:v="urn:schemas-microsoft-com:vml" xmlns:wp14="http://schemas.microsoft.com/office/word/2010/wordprocessingDrawing" xmlns:wp="http://schemas.openxmlformats.org/drawingml/2006/wordprocessingDrawing" xmlns:w10="urn:schemas-microsoft-com:office:word" xmlns:w="http://schemas.openxmlformats.org/wordprocessingml/2006/main" xmlns:w14="http://schemas.microsoft.com/office/word/2010/wordml" xmlns:w15="http://schemas.microsoft.com/office/word/2012/wordml" xmlns:w16cex="http://schemas.microsoft.com/office/word/2018/wordml/cex" xmlns:w16cid="http://schemas.microsoft.com/office/word/2016/wordml/cid" xmlns:w16="http://schemas.microsoft.com/office/word/2018/wordml" xmlns:w16sdtdh="http://schemas.microsoft.com/office/word/2020/wordml/sdtdatahash" xmlns:w16se="http://schemas.microsoft.com/office/word/2015/wordml/symex" xmlns:wpg="http://schemas.microsoft.com/office/word/2010/wordprocessingGroup" xmlns:wpi="http://schemas.microsoft.com/office/word/2010/wordprocessingInk" xmlns:wne="http://schemas.microsoft.com/office/word/2006/wordml" xmlns:wps="http://schemas.microsoft.com/office/word/2010/wordprocessingShape" mc:Ignorable="w14 w15 w16se w16cid w16 w16cex w16sdtdh wp14">
+<w:document xmlns:wpc="http://schemas.microsoft.com/office/word/2010/wordprocessingCanvas" xmlns:cx="http://schemas.microsoft.com/office/drawing/2014/chartex" xmlns:cx1="http://schemas.microsoft.com/office/drawing/2015/9/8/chartex" xmlns:cx2="http://schemas.microsoft.com/office/drawing/2015/10/21/chartex" xmlns:cx3="http://schemas.microsoft.com/office/drawing/2016/5/9/chartex" xmlns:cx4="http://schemas.microsoft.com/office/drawing/2016/5/10/chartex" xmlns:cx5="http://schemas.microsoft.com/office/drawing/2016/5/11/chartex" xmlns:cx6="http://schemas.microsoft.com/office/drawing/2016/5/12/chartex" xmlns:cx7="http://schemas.microsoft.com/office/drawing/2016/5/13/chartex" xmlns:cx8="http://schemas.microsoft.com/office/drawing/2016/5/14/chartex" xmlns:mc="http://schemas.openxmlformats.org/markup-compatibility/2006" xmlns:aink="http://schemas.microsoft.com/office/drawing/2016/ink" xmlns:am3d="http://schemas.microsoft.com/office/drawing/2017/model3d" xmlns:o="urn:schemas-microsoft-com:office:office" xmlns:oel="http://schemas.microsoft.com/office/2019/extlst" xmlns:r="http://schemas.openxmlformats.org/officeDocument/2006/relationships" xmlns:m="http://schemas.openxmlformats.org/officeDocument/2006/math" xmlns:v="urn:schemas-microsoft-com:vml" xmlns:wp14="http://schemas.microsoft.com/office/word/2010/wordprocessingDrawing" xmlns:wp="http://schemas.openxmlformats.org/drawingml/2006/wordprocessingDrawing" xmlns:w10="urn:schemas-microsoft-com:office:word" xmlns:w="http://schemas.openxmlformats.org/wordprocessingml/2006/main" xmlns:w14="http://schemas.microsoft.com/office/word/2010/wordml" xmlns:w15="http://schemas.microsoft.com/office/word/2012/wordml" xmlns:w16cex="http://schemas.microsoft.com/office/word/2018/wordml/cex" xmlns:w16cid="http://schemas.microsoft.com/office/word/2016/wordml/cid" xmlns:w16="http://schemas.microsoft.com/office/word/2018/wordml" xmlns:w16sdtdh="http://schemas.microsoft.com/office/word/2020/wordml/sdtdatahash" xmlns:w16se="http://schemas.microsoft.com/office/word/2015/wordml/symex" xmlns:wpg="http://schemas.microsoft.com/office/word/2010/wordprocessingGroup" xmlns:wpi="http://schemas.microsoft.com/office/word/2010/wordprocessingInk" xmlns:wne="http://schemas.microsoft.com/office/word/2006/wordml" xmlns:wps="http://schemas.microsoft.com/office/word/2010/wordprocessingShape" mc:Ignorable="w14 w15 w16se w16cid w16 w16cex w16sdtdh wp14">
   <w:body>
     <w:p>
       <w:pPr>
@@ -431,9 +431,9 @@
         <mc:AlternateContent>
           <mc:Choice Requires="wps">
             <w:drawing>
-              <wp:inline distT="0" distB="0" distL="0" distR="0" wp14:anchorId="184EE9DE" wp14:editId="1963162F">
-                <wp:extent cx="6249866" cy="272034"/>
-                <wp:effectExtent l="57150" t="57150" r="17780" b="13970"/>
+              <wp:inline distT="0" distB="0" distL="0" distR="0" wp14:anchorId="184EE9DE" wp14:editId="15B24B9D">
+                <wp:extent cx="6249866" cy="451733"/>
+                <wp:effectExtent l="57150" t="57150" r="17780" b="24765"/>
                 <wp:docPr id="14" name="Zone de texte 14"/>
                 <wp:cNvGraphicFramePr>
                   <a:graphicFrameLocks xmlns:a="http://schemas.openxmlformats.org/drawingml/2006/main"/>
@@ -447,7 +447,7 @@
                       <wps:spPr bwMode="auto">
                         <a:xfrm>
                           <a:off x="0" y="0"/>
-                          <a:ext cx="6249866" cy="272034"/>
+                          <a:ext cx="6249866" cy="451733"/>
                         </a:xfrm>
                         <a:prstGeom prst="rect">
                           <a:avLst/>
@@ -522,7 +522,7 @@
                 <v:stroke joinstyle="miter"/>
                 <v:path gradientshapeok="t" o:connecttype="rect"/>
               </v:shapetype>
-              <v:shape id="Zone de texte 14" o:spid="_x0000_s1026" type="#_x0000_t202" style="width:492.1pt;height:21.4pt;visibility:visible;mso-wrap-style:square;mso-left-percent:-10001;mso-top-percent:-10001;mso-position-horizontal:absolute;mso-position-horizontal-relative:char;mso-position-vertical:absolute;mso-position-vertical-relative:line;mso-left-percent:-10001;mso-top-percent:-10001;v-text-anchor:top" o:gfxdata="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" strokeweight="1pt">
+              <v:shape id="Zone de texte 14" o:spid="_x0000_s1026" type="#_x0000_t202" style="width:492.1pt;height:35.55pt;visibility:visible;mso-wrap-style:square;mso-left-percent:-10001;mso-top-percent:-10001;mso-position-horizontal:absolute;mso-position-horizontal-relative:char;mso-position-vertical:absolute;mso-position-vertical-relative:line;mso-left-percent:-10001;mso-top-percent:-10001;v-text-anchor:top" o:gfxdata="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" strokeweight="1pt">
                 <v:stroke linestyle="thinThin"/>
                 <v:shadow on="t" color="#d8d8d8 [2732]" origin=".5,.5" offset="-1.24725mm,-1.24725mm"/>
                 <v:textbox>
@@ -1784,9 +1784,9 @@
         <mc:AlternateContent>
           <mc:Choice Requires="wps">
             <w:drawing>
-              <wp:inline distT="0" distB="0" distL="0" distR="0" wp14:anchorId="6E56E1B0" wp14:editId="161D03D1">
-                <wp:extent cx="6249866" cy="857250"/>
-                <wp:effectExtent l="57150" t="57150" r="17780" b="19050"/>
+              <wp:inline distT="0" distB="0" distL="0" distR="0" wp14:anchorId="6E56E1B0" wp14:editId="0CF71E87">
+                <wp:extent cx="6249866" cy="539198"/>
+                <wp:effectExtent l="57150" t="57150" r="17780" b="13335"/>
                 <wp:docPr id="38" name="Zone de texte 38"/>
                 <wp:cNvGraphicFramePr>
                   <a:graphicFrameLocks xmlns:a="http://schemas.openxmlformats.org/drawingml/2006/main"/>
@@ -1800,7 +1800,7 @@
                       <wps:spPr bwMode="auto">
                         <a:xfrm>
                           <a:off x="0" y="0"/>
-                          <a:ext cx="6249866" cy="857250"/>
+                          <a:ext cx="6249866" cy="539198"/>
                         </a:xfrm>
                         <a:prstGeom prst="rect">
                           <a:avLst/>
@@ -1961,7 +1961,7 @@
           </mc:Choice>
           <mc:Fallback>
             <w:pict>
-              <v:shape w14:anchorId="6E56E1B0" id="Zone de texte 38" o:spid="_x0000_s1030" type="#_x0000_t202" style="width:492.1pt;height:67.5pt;visibility:visible;mso-wrap-style:square;mso-left-percent:-10001;mso-top-percent:-10001;mso-position-horizontal:absolute;mso-position-horizontal-relative:char;mso-position-vertical:absolute;mso-position-vertical-relative:line;mso-left-percent:-10001;mso-top-percent:-10001;v-text-anchor:top" o:gfxdata="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" strokeweight="1pt">
+              <v:shape w14:anchorId="6E56E1B0" id="Zone de texte 38" o:spid="_x0000_s1030" type="#_x0000_t202" style="width:492.1pt;height:42.45pt;visibility:visible;mso-wrap-style:square;mso-left-percent:-10001;mso-top-percent:-10001;mso-position-horizontal:absolute;mso-position-horizontal-relative:char;mso-position-vertical:absolute;mso-position-vertical-relative:line;mso-left-percent:-10001;mso-top-percent:-10001;v-text-anchor:top" o:gfxdata="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" strokeweight="1pt">
                 <v:stroke linestyle="thinThin"/>
                 <v:shadow on="t" color="#d8d8d8 [2732]" origin=".5,.5" offset="-1.24725mm,-1.24725mm"/>
                 <v:textbox>
@@ -2049,31 +2049,7 @@
                               <w:sz w:val="36"/>
                               <w:szCs w:val="36"/>
                             </w:rPr>
-                            <m:t>A</m:t>
-                          </m:r>
-                          <m:r>
-                            <w:rPr>
-                              <w:rFonts w:ascii="Cambria Math" w:hAnsi="Cambria Math"/>
-                              <w:sz w:val="36"/>
-                              <w:szCs w:val="36"/>
-                            </w:rPr>
-                            <m:t>=</m:t>
-                          </m:r>
-                          <m:r>
-                            <w:rPr>
-                              <w:rFonts w:ascii="Cambria Math" w:hAnsi="Cambria Math"/>
-                              <w:sz w:val="36"/>
-                              <w:szCs w:val="36"/>
-                            </w:rPr>
-                            <m:t>4</m:t>
-                          </m:r>
-                          <m:r>
-                            <w:rPr>
-                              <w:rFonts w:ascii="Cambria Math" w:hAnsi="Cambria Math"/>
-                              <w:sz w:val="36"/>
-                              <w:szCs w:val="36"/>
-                            </w:rPr>
-                            <m:t>π</m:t>
+                            <m:t>A=4π</m:t>
                           </m:r>
                           <m:sSup>
                             <m:sSupPr>
@@ -2944,7 +2920,6 @@
                 <w:noProof/>
                 <w:lang w:eastAsia="fr-FR"/>
               </w:rPr>
-              <w:lastRenderedPageBreak/>
               <w:drawing>
                 <wp:inline distT="0" distB="0" distL="0" distR="0" wp14:anchorId="3F931C5C" wp14:editId="09B3BB2F">
                   <wp:extent cx="1438275" cy="1438275"/>
@@ -3161,6 +3136,7 @@
           <w:rStyle w:val="Accentuationlgre"/>
           <w:lang w:eastAsia="fr-FR"/>
         </w:rPr>
+        <w:lastRenderedPageBreak/>
         <w:t>Autres</w:t>
       </w:r>
       <w:r>
@@ -5028,13 +5004,11 @@
         </w:tc>
       </w:tr>
     </w:tbl>
-    <w:p>
-      <w:pPr>
-        <w:rPr>
-          <w:lang w:eastAsia="fr-FR"/>
-        </w:rPr>
-      </w:pPr>
-    </w:p>
+    <w:p/>
+    <w:p/>
+    <w:p/>
+    <w:p/>
+    <w:p/>
     <w:p>
       <w:pPr>
         <w:pStyle w:val="Titre2"/>
@@ -6946,7 +6920,7 @@
 </file>
 
 <file path=word/endnotes.xml><?xml version="1.0" encoding="utf-8"?>
-<w:endnotes xmlns:wpc="http://schemas.microsoft.com/office/word/2010/wordprocessingCanvas" xmlns:cx="http://schemas.microsoft.com/office/drawing/2014/chartex" xmlns:cx1="http://schemas.microsoft.com/office/drawing/2015/9/8/chartex" xmlns:cx2="http://schemas.microsoft.com/office/drawing/2015/10/21/chartex" xmlns:cx3="http://schemas.microsoft.com/office/drawing/2016/5/9/chartex" xmlns:cx4="http://schemas.microsoft.com/office/drawing/2016/5/10/chartex" xmlns:cx5="http://schemas.microsoft.com/office/drawing/2016/5/11/chartex" xmlns:cx6="http://schemas.microsoft.com/office/drawing/2016/5/12/chartex" xmlns:cx7="http://schemas.microsoft.com/office/drawing/2016/5/13/chartex" xmlns:cx8="http://schemas.microsoft.com/office/drawing/2016/5/14/chartex" xmlns:mc="http://schemas.openxmlformats.org/markup-compatibility/2006" xmlns:aink="http://schemas.microsoft.com/office/drawing/2016/ink" xmlns:am3d="http://schemas.microsoft.com/office/drawing/2017/model3d" xmlns:o="urn:schemas-microsoft-com:office:office" xmlns:r="http://schemas.openxmlformats.org/officeDocument/2006/relationships" xmlns:m="http://schemas.openxmlformats.org/officeDocument/2006/math" xmlns:v="urn:schemas-microsoft-com:vml" xmlns:wp14="http://schemas.microsoft.com/office/word/2010/wordprocessingDrawing" xmlns:wp="http://schemas.openxmlformats.org/drawingml/2006/wordprocessingDrawing" xmlns:w10="urn:schemas-microsoft-com:office:word" xmlns:w="http://schemas.openxmlformats.org/wordprocessingml/2006/main" xmlns:w14="http://schemas.microsoft.com/office/word/2010/wordml" xmlns:w15="http://schemas.microsoft.com/office/word/2012/wordml" xmlns:w16cex="http://schemas.microsoft.com/office/word/2018/wordml/cex" xmlns:w16cid="http://schemas.microsoft.com/office/word/2016/wordml/cid" xmlns:w16="http://schemas.microsoft.com/office/word/2018/wordml" xmlns:w16sdtdh="http://schemas.microsoft.com/office/word/2020/wordml/sdtdatahash" xmlns:w16se="http://schemas.microsoft.com/office/word/2015/wordml/symex" xmlns:wpg="http://schemas.microsoft.com/office/word/2010/wordprocessingGroup" xmlns:wpi="http://schemas.microsoft.com/office/word/2010/wordprocessingInk" xmlns:wne="http://schemas.microsoft.com/office/word/2006/wordml" xmlns:wps="http://schemas.microsoft.com/office/word/2010/wordprocessingShape" mc:Ignorable="w14 w15 w16se w16cid w16 w16cex w16sdtdh wp14">
+<w:endnotes xmlns:wpc="http://schemas.microsoft.com/office/word/2010/wordprocessingCanvas" xmlns:cx="http://schemas.microsoft.com/office/drawing/2014/chartex" xmlns:cx1="http://schemas.microsoft.com/office/drawing/2015/9/8/chartex" xmlns:cx2="http://schemas.microsoft.com/office/drawing/2015/10/21/chartex" xmlns:cx3="http://schemas.microsoft.com/office/drawing/2016/5/9/chartex" xmlns:cx4="http://schemas.microsoft.com/office/drawing/2016/5/10/chartex" xmlns:cx5="http://schemas.microsoft.com/office/drawing/2016/5/11/chartex" xmlns:cx6="http://schemas.microsoft.com/office/drawing/2016/5/12/chartex" xmlns:cx7="http://schemas.microsoft.com/office/drawing/2016/5/13/chartex" xmlns:cx8="http://schemas.microsoft.com/office/drawing/2016/5/14/chartex" xmlns:mc="http://schemas.openxmlformats.org/markup-compatibility/2006" xmlns:aink="http://schemas.microsoft.com/office/drawing/2016/ink" xmlns:am3d="http://schemas.microsoft.com/office/drawing/2017/model3d" xmlns:o="urn:schemas-microsoft-com:office:office" xmlns:oel="http://schemas.microsoft.com/office/2019/extlst" xmlns:r="http://schemas.openxmlformats.org/officeDocument/2006/relationships" xmlns:m="http://schemas.openxmlformats.org/officeDocument/2006/math" xmlns:v="urn:schemas-microsoft-com:vml" xmlns:wp14="http://schemas.microsoft.com/office/word/2010/wordprocessingDrawing" xmlns:wp="http://schemas.openxmlformats.org/drawingml/2006/wordprocessingDrawing" xmlns:w10="urn:schemas-microsoft-com:office:word" xmlns:w="http://schemas.openxmlformats.org/wordprocessingml/2006/main" xmlns:w14="http://schemas.microsoft.com/office/word/2010/wordml" xmlns:w15="http://schemas.microsoft.com/office/word/2012/wordml" xmlns:w16cex="http://schemas.microsoft.com/office/word/2018/wordml/cex" xmlns:w16cid="http://schemas.microsoft.com/office/word/2016/wordml/cid" xmlns:w16="http://schemas.microsoft.com/office/word/2018/wordml" xmlns:w16sdtdh="http://schemas.microsoft.com/office/word/2020/wordml/sdtdatahash" xmlns:w16se="http://schemas.microsoft.com/office/word/2015/wordml/symex" xmlns:wpg="http://schemas.microsoft.com/office/word/2010/wordprocessingGroup" xmlns:wpi="http://schemas.microsoft.com/office/word/2010/wordprocessingInk" xmlns:wne="http://schemas.microsoft.com/office/word/2006/wordml" xmlns:wps="http://schemas.microsoft.com/office/word/2010/wordprocessingShape" mc:Ignorable="w14 w15 w16se w16cid w16 w16cex w16sdtdh wp14">
   <w:endnote w:type="separator" w:id="-1">
     <w:p>
       <w:pPr>
@@ -6971,7 +6945,7 @@
 </file>
 
 <file path=word/footer1.xml><?xml version="1.0" encoding="utf-8"?>
-<w:ftr xmlns:wpc="http://schemas.microsoft.com/office/word/2010/wordprocessingCanvas" xmlns:cx="http://schemas.microsoft.com/office/drawing/2014/chartex" xmlns:cx1="http://schemas.microsoft.com/office/drawing/2015/9/8/chartex" xmlns:cx2="http://schemas.microsoft.com/office/drawing/2015/10/21/chartex" xmlns:cx3="http://schemas.microsoft.com/office/drawing/2016/5/9/chartex" xmlns:cx4="http://schemas.microsoft.com/office/drawing/2016/5/10/chartex" xmlns:cx5="http://schemas.microsoft.com/office/drawing/2016/5/11/chartex" xmlns:cx6="http://schemas.microsoft.com/office/drawing/2016/5/12/chartex" xmlns:cx7="http://schemas.microsoft.com/office/drawing/2016/5/13/chartex" xmlns:cx8="http://schemas.microsoft.com/office/drawing/2016/5/14/chartex" xmlns:mc="http://schemas.openxmlformats.org/markup-compatibility/2006" xmlns:aink="http://schemas.microsoft.com/office/drawing/2016/ink" xmlns:am3d="http://schemas.microsoft.com/office/drawing/2017/model3d" xmlns:o="urn:schemas-microsoft-com:office:office" xmlns:r="http://schemas.openxmlformats.org/officeDocument/2006/relationships" xmlns:m="http://schemas.openxmlformats.org/officeDocument/2006/math" xmlns:v="urn:schemas-microsoft-com:vml" xmlns:wp14="http://schemas.microsoft.com/office/word/2010/wordprocessingDrawing" xmlns:wp="http://schemas.openxmlformats.org/drawingml/2006/wordprocessingDrawing" xmlns:w10="urn:schemas-microsoft-com:office:word" xmlns:w="http://schemas.openxmlformats.org/wordprocessingml/2006/main" xmlns:w14="http://schemas.microsoft.com/office/word/2010/wordml" xmlns:w15="http://schemas.microsoft.com/office/word/2012/wordml" xmlns:w16cex="http://schemas.microsoft.com/office/word/2018/wordml/cex" xmlns:w16cid="http://schemas.microsoft.com/office/word/2016/wordml/cid" xmlns:w16="http://schemas.microsoft.com/office/word/2018/wordml" xmlns:w16sdtdh="http://schemas.microsoft.com/office/word/2020/wordml/sdtdatahash" xmlns:w16se="http://schemas.microsoft.com/office/word/2015/wordml/symex" xmlns:wpg="http://schemas.microsoft.com/office/word/2010/wordprocessingGroup" xmlns:wpi="http://schemas.microsoft.com/office/word/2010/wordprocessingInk" xmlns:wne="http://schemas.microsoft.com/office/word/2006/wordml" xmlns:wps="http://schemas.microsoft.com/office/word/2010/wordprocessingShape" mc:Ignorable="w14 w15 w16se w16cid w16 w16cex w16sdtdh wp14">
+<w:ftr xmlns:wpc="http://schemas.microsoft.com/office/word/2010/wordprocessingCanvas" xmlns:cx="http://schemas.microsoft.com/office/drawing/2014/chartex" xmlns:cx1="http://schemas.microsoft.com/office/drawing/2015/9/8/chartex" xmlns:cx2="http://schemas.microsoft.com/office/drawing/2015/10/21/chartex" xmlns:cx3="http://schemas.microsoft.com/office/drawing/2016/5/9/chartex" xmlns:cx4="http://schemas.microsoft.com/office/drawing/2016/5/10/chartex" xmlns:cx5="http://schemas.microsoft.com/office/drawing/2016/5/11/chartex" xmlns:cx6="http://schemas.microsoft.com/office/drawing/2016/5/12/chartex" xmlns:cx7="http://schemas.microsoft.com/office/drawing/2016/5/13/chartex" xmlns:cx8="http://schemas.microsoft.com/office/drawing/2016/5/14/chartex" xmlns:mc="http://schemas.openxmlformats.org/markup-compatibility/2006" xmlns:aink="http://schemas.microsoft.com/office/drawing/2016/ink" xmlns:am3d="http://schemas.microsoft.com/office/drawing/2017/model3d" xmlns:o="urn:schemas-microsoft-com:office:office" xmlns:oel="http://schemas.microsoft.com/office/2019/extlst" xmlns:r="http://schemas.openxmlformats.org/officeDocument/2006/relationships" xmlns:m="http://schemas.openxmlformats.org/officeDocument/2006/math" xmlns:v="urn:schemas-microsoft-com:vml" xmlns:wp14="http://schemas.microsoft.com/office/word/2010/wordprocessingDrawing" xmlns:wp="http://schemas.openxmlformats.org/drawingml/2006/wordprocessingDrawing" xmlns:w10="urn:schemas-microsoft-com:office:word" xmlns:w="http://schemas.openxmlformats.org/wordprocessingml/2006/main" xmlns:w14="http://schemas.microsoft.com/office/word/2010/wordml" xmlns:w15="http://schemas.microsoft.com/office/word/2012/wordml" xmlns:w16cex="http://schemas.microsoft.com/office/word/2018/wordml/cex" xmlns:w16cid="http://schemas.microsoft.com/office/word/2016/wordml/cid" xmlns:w16="http://schemas.microsoft.com/office/word/2018/wordml" xmlns:w16sdtdh="http://schemas.microsoft.com/office/word/2020/wordml/sdtdatahash" xmlns:w16se="http://schemas.microsoft.com/office/word/2015/wordml/symex" xmlns:wpg="http://schemas.microsoft.com/office/word/2010/wordprocessingGroup" xmlns:wpi="http://schemas.microsoft.com/office/word/2010/wordprocessingInk" xmlns:wne="http://schemas.microsoft.com/office/word/2006/wordml" xmlns:wps="http://schemas.microsoft.com/office/word/2010/wordprocessingShape" mc:Ignorable="w14 w15 w16se w16cid w16 w16cex w16sdtdh wp14">
   <w:p>
     <w:pPr>
       <w:pStyle w:val="Pieddepage"/>
@@ -7173,7 +7147,7 @@
 </file>
 
 <file path=word/footer2.xml><?xml version="1.0" encoding="utf-8"?>
-<w:ftr xmlns:wpc="http://schemas.microsoft.com/office/word/2010/wordprocessingCanvas" xmlns:cx="http://schemas.microsoft.com/office/drawing/2014/chartex" xmlns:cx1="http://schemas.microsoft.com/office/drawing/2015/9/8/chartex" xmlns:cx2="http://schemas.microsoft.com/office/drawing/2015/10/21/chartex" xmlns:cx3="http://schemas.microsoft.com/office/drawing/2016/5/9/chartex" xmlns:cx4="http://schemas.microsoft.com/office/drawing/2016/5/10/chartex" xmlns:cx5="http://schemas.microsoft.com/office/drawing/2016/5/11/chartex" xmlns:cx6="http://schemas.microsoft.com/office/drawing/2016/5/12/chartex" xmlns:cx7="http://schemas.microsoft.com/office/drawing/2016/5/13/chartex" xmlns:cx8="http://schemas.microsoft.com/office/drawing/2016/5/14/chartex" xmlns:mc="http://schemas.openxmlformats.org/markup-compatibility/2006" xmlns:aink="http://schemas.microsoft.com/office/drawing/2016/ink" xmlns:am3d="http://schemas.microsoft.com/office/drawing/2017/model3d" xmlns:o="urn:schemas-microsoft-com:office:office" xmlns:r="http://schemas.openxmlformats.org/officeDocument/2006/relationships" xmlns:m="http://schemas.openxmlformats.org/officeDocument/2006/math" xmlns:v="urn:schemas-microsoft-com:vml" xmlns:wp14="http://schemas.microsoft.com/office/word/2010/wordprocessingDrawing" xmlns:wp="http://schemas.openxmlformats.org/drawingml/2006/wordprocessingDrawing" xmlns:w10="urn:schemas-microsoft-com:office:word" xmlns:w="http://schemas.openxmlformats.org/wordprocessingml/2006/main" xmlns:w14="http://schemas.microsoft.com/office/word/2010/wordml" xmlns:w15="http://schemas.microsoft.com/office/word/2012/wordml" xmlns:w16cex="http://schemas.microsoft.com/office/word/2018/wordml/cex" xmlns:w16cid="http://schemas.microsoft.com/office/word/2016/wordml/cid" xmlns:w16="http://schemas.microsoft.com/office/word/2018/wordml" xmlns:w16sdtdh="http://schemas.microsoft.com/office/word/2020/wordml/sdtdatahash" xmlns:w16se="http://schemas.microsoft.com/office/word/2015/wordml/symex" xmlns:wpg="http://schemas.microsoft.com/office/word/2010/wordprocessingGroup" xmlns:wpi="http://schemas.microsoft.com/office/word/2010/wordprocessingInk" xmlns:wne="http://schemas.microsoft.com/office/word/2006/wordml" xmlns:wps="http://schemas.microsoft.com/office/word/2010/wordprocessingShape" mc:Ignorable="w14 w15 w16se w16cid w16 w16cex w16sdtdh wp14">
+<w:ftr xmlns:wpc="http://schemas.microsoft.com/office/word/2010/wordprocessingCanvas" xmlns:cx="http://schemas.microsoft.com/office/drawing/2014/chartex" xmlns:cx1="http://schemas.microsoft.com/office/drawing/2015/9/8/chartex" xmlns:cx2="http://schemas.microsoft.com/office/drawing/2015/10/21/chartex" xmlns:cx3="http://schemas.microsoft.com/office/drawing/2016/5/9/chartex" xmlns:cx4="http://schemas.microsoft.com/office/drawing/2016/5/10/chartex" xmlns:cx5="http://schemas.microsoft.com/office/drawing/2016/5/11/chartex" xmlns:cx6="http://schemas.microsoft.com/office/drawing/2016/5/12/chartex" xmlns:cx7="http://schemas.microsoft.com/office/drawing/2016/5/13/chartex" xmlns:cx8="http://schemas.microsoft.com/office/drawing/2016/5/14/chartex" xmlns:mc="http://schemas.openxmlformats.org/markup-compatibility/2006" xmlns:aink="http://schemas.microsoft.com/office/drawing/2016/ink" xmlns:am3d="http://schemas.microsoft.com/office/drawing/2017/model3d" xmlns:o="urn:schemas-microsoft-com:office:office" xmlns:oel="http://schemas.microsoft.com/office/2019/extlst" xmlns:r="http://schemas.openxmlformats.org/officeDocument/2006/relationships" xmlns:m="http://schemas.openxmlformats.org/officeDocument/2006/math" xmlns:v="urn:schemas-microsoft-com:vml" xmlns:wp14="http://schemas.microsoft.com/office/word/2010/wordprocessingDrawing" xmlns:wp="http://schemas.openxmlformats.org/drawingml/2006/wordprocessingDrawing" xmlns:w10="urn:schemas-microsoft-com:office:word" xmlns:w="http://schemas.openxmlformats.org/wordprocessingml/2006/main" xmlns:w14="http://schemas.microsoft.com/office/word/2010/wordml" xmlns:w15="http://schemas.microsoft.com/office/word/2012/wordml" xmlns:w16cex="http://schemas.microsoft.com/office/word/2018/wordml/cex" xmlns:w16cid="http://schemas.microsoft.com/office/word/2016/wordml/cid" xmlns:w16="http://schemas.microsoft.com/office/word/2018/wordml" xmlns:w16sdtdh="http://schemas.microsoft.com/office/word/2020/wordml/sdtdatahash" xmlns:w16se="http://schemas.microsoft.com/office/word/2015/wordml/symex" xmlns:wpg="http://schemas.microsoft.com/office/word/2010/wordprocessingGroup" xmlns:wpi="http://schemas.microsoft.com/office/word/2010/wordprocessingInk" xmlns:wne="http://schemas.microsoft.com/office/word/2006/wordml" xmlns:wps="http://schemas.microsoft.com/office/word/2010/wordprocessingShape" mc:Ignorable="w14 w15 w16se w16cid w16 w16cex w16sdtdh wp14">
   <w:p>
     <w:pPr>
       <w:pStyle w:val="Pieddepage"/>
@@ -7375,7 +7349,7 @@
 </file>
 
 <file path=word/footnotes.xml><?xml version="1.0" encoding="utf-8"?>
-<w:footnotes xmlns:wpc="http://schemas.microsoft.com/office/word/2010/wordprocessingCanvas" xmlns:cx="http://schemas.microsoft.com/office/drawing/2014/chartex" xmlns:cx1="http://schemas.microsoft.com/office/drawing/2015/9/8/chartex" xmlns:cx2="http://schemas.microsoft.com/office/drawing/2015/10/21/chartex" xmlns:cx3="http://schemas.microsoft.com/office/drawing/2016/5/9/chartex" xmlns:cx4="http://schemas.microsoft.com/office/drawing/2016/5/10/chartex" xmlns:cx5="http://schemas.microsoft.com/office/drawing/2016/5/11/chartex" xmlns:cx6="http://schemas.microsoft.com/office/drawing/2016/5/12/chartex" xmlns:cx7="http://schemas.microsoft.com/office/drawing/2016/5/13/chartex" xmlns:cx8="http://schemas.microsoft.com/office/drawing/2016/5/14/chartex" xmlns:mc="http://schemas.openxmlformats.org/markup-compatibility/2006" xmlns:aink="http://schemas.microsoft.com/office/drawing/2016/ink" xmlns:am3d="http://schemas.microsoft.com/office/drawing/2017/model3d" xmlns:o="urn:schemas-microsoft-com:office:office" xmlns:r="http://schemas.openxmlformats.org/officeDocument/2006/relationships" xmlns:m="http://schemas.openxmlformats.org/officeDocument/2006/math" xmlns:v="urn:schemas-microsoft-com:vml" xmlns:wp14="http://schemas.microsoft.com/office/word/2010/wordprocessingDrawing" xmlns:wp="http://schemas.openxmlformats.org/drawingml/2006/wordprocessingDrawing" xmlns:w10="urn:schemas-microsoft-com:office:word" xmlns:w="http://schemas.openxmlformats.org/wordprocessingml/2006/main" xmlns:w14="http://schemas.microsoft.com/office/word/2010/wordml" xmlns:w15="http://schemas.microsoft.com/office/word/2012/wordml" xmlns:w16cex="http://schemas.microsoft.com/office/word/2018/wordml/cex" xmlns:w16cid="http://schemas.microsoft.com/office/word/2016/wordml/cid" xmlns:w16="http://schemas.microsoft.com/office/word/2018/wordml" xmlns:w16sdtdh="http://schemas.microsoft.com/office/word/2020/wordml/sdtdatahash" xmlns:w16se="http://schemas.microsoft.com/office/word/2015/wordml/symex" xmlns:wpg="http://schemas.microsoft.com/office/word/2010/wordprocessingGroup" xmlns:wpi="http://schemas.microsoft.com/office/word/2010/wordprocessingInk" xmlns:wne="http://schemas.microsoft.com/office/word/2006/wordml" xmlns:wps="http://schemas.microsoft.com/office/word/2010/wordprocessingShape" mc:Ignorable="w14 w15 w16se w16cid w16 w16cex w16sdtdh wp14">
+<w:footnotes xmlns:wpc="http://schemas.microsoft.com/office/word/2010/wordprocessingCanvas" xmlns:cx="http://schemas.microsoft.com/office/drawing/2014/chartex" xmlns:cx1="http://schemas.microsoft.com/office/drawing/2015/9/8/chartex" xmlns:cx2="http://schemas.microsoft.com/office/drawing/2015/10/21/chartex" xmlns:cx3="http://schemas.microsoft.com/office/drawing/2016/5/9/chartex" xmlns:cx4="http://schemas.microsoft.com/office/drawing/2016/5/10/chartex" xmlns:cx5="http://schemas.microsoft.com/office/drawing/2016/5/11/chartex" xmlns:cx6="http://schemas.microsoft.com/office/drawing/2016/5/12/chartex" xmlns:cx7="http://schemas.microsoft.com/office/drawing/2016/5/13/chartex" xmlns:cx8="http://schemas.microsoft.com/office/drawing/2016/5/14/chartex" xmlns:mc="http://schemas.openxmlformats.org/markup-compatibility/2006" xmlns:aink="http://schemas.microsoft.com/office/drawing/2016/ink" xmlns:am3d="http://schemas.microsoft.com/office/drawing/2017/model3d" xmlns:o="urn:schemas-microsoft-com:office:office" xmlns:oel="http://schemas.microsoft.com/office/2019/extlst" xmlns:r="http://schemas.openxmlformats.org/officeDocument/2006/relationships" xmlns:m="http://schemas.openxmlformats.org/officeDocument/2006/math" xmlns:v="urn:schemas-microsoft-com:vml" xmlns:wp14="http://schemas.microsoft.com/office/word/2010/wordprocessingDrawing" xmlns:wp="http://schemas.openxmlformats.org/drawingml/2006/wordprocessingDrawing" xmlns:w10="urn:schemas-microsoft-com:office:word" xmlns:w="http://schemas.openxmlformats.org/wordprocessingml/2006/main" xmlns:w14="http://schemas.microsoft.com/office/word/2010/wordml" xmlns:w15="http://schemas.microsoft.com/office/word/2012/wordml" xmlns:w16cex="http://schemas.microsoft.com/office/word/2018/wordml/cex" xmlns:w16cid="http://schemas.microsoft.com/office/word/2016/wordml/cid" xmlns:w16="http://schemas.microsoft.com/office/word/2018/wordml" xmlns:w16sdtdh="http://schemas.microsoft.com/office/word/2020/wordml/sdtdatahash" xmlns:w16se="http://schemas.microsoft.com/office/word/2015/wordml/symex" xmlns:wpg="http://schemas.microsoft.com/office/word/2010/wordprocessingGroup" xmlns:wpi="http://schemas.microsoft.com/office/word/2010/wordprocessingInk" xmlns:wne="http://schemas.microsoft.com/office/word/2006/wordml" xmlns:wps="http://schemas.microsoft.com/office/word/2010/wordprocessingShape" mc:Ignorable="w14 w15 w16se w16cid w16 w16cex w16sdtdh wp14">
   <w:footnote w:type="separator" w:id="-1">
     <w:p>
       <w:pPr>
@@ -7400,7 +7374,7 @@
 </file>
 
 <file path=word/header1.xml><?xml version="1.0" encoding="utf-8"?>
-<w:hdr xmlns:wpc="http://schemas.microsoft.com/office/word/2010/wordprocessingCanvas" xmlns:cx="http://schemas.microsoft.com/office/drawing/2014/chartex" xmlns:cx1="http://schemas.microsoft.com/office/drawing/2015/9/8/chartex" xmlns:cx2="http://schemas.microsoft.com/office/drawing/2015/10/21/chartex" xmlns:cx3="http://schemas.microsoft.com/office/drawing/2016/5/9/chartex" xmlns:cx4="http://schemas.microsoft.com/office/drawing/2016/5/10/chartex" xmlns:cx5="http://schemas.microsoft.com/office/drawing/2016/5/11/chartex" xmlns:cx6="http://schemas.microsoft.com/office/drawing/2016/5/12/chartex" xmlns:cx7="http://schemas.microsoft.com/office/drawing/2016/5/13/chartex" xmlns:cx8="http://schemas.microsoft.com/office/drawing/2016/5/14/chartex" xmlns:mc="http://schemas.openxmlformats.org/markup-compatibility/2006" xmlns:aink="http://schemas.microsoft.com/office/drawing/2016/ink" xmlns:am3d="http://schemas.microsoft.com/office/drawing/2017/model3d" xmlns:o="urn:schemas-microsoft-com:office:office" xmlns:r="http://schemas.openxmlformats.org/officeDocument/2006/relationships" xmlns:m="http://schemas.openxmlformats.org/officeDocument/2006/math" xmlns:v="urn:schemas-microsoft-com:vml" xmlns:wp14="http://schemas.microsoft.com/office/word/2010/wordprocessingDrawing" xmlns:wp="http://schemas.openxmlformats.org/drawingml/2006/wordprocessingDrawing" xmlns:w10="urn:schemas-microsoft-com:office:word" xmlns:w="http://schemas.openxmlformats.org/wordprocessingml/2006/main" xmlns:w14="http://schemas.microsoft.com/office/word/2010/wordml" xmlns:w15="http://schemas.microsoft.com/office/word/2012/wordml" xmlns:w16cex="http://schemas.microsoft.com/office/word/2018/wordml/cex" xmlns:w16cid="http://schemas.microsoft.com/office/word/2016/wordml/cid" xmlns:w16="http://schemas.microsoft.com/office/word/2018/wordml" xmlns:w16sdtdh="http://schemas.microsoft.com/office/word/2020/wordml/sdtdatahash" xmlns:w16se="http://schemas.microsoft.com/office/word/2015/wordml/symex" xmlns:wpg="http://schemas.microsoft.com/office/word/2010/wordprocessingGroup" xmlns:wpi="http://schemas.microsoft.com/office/word/2010/wordprocessingInk" xmlns:wne="http://schemas.microsoft.com/office/word/2006/wordml" xmlns:wps="http://schemas.microsoft.com/office/word/2010/wordprocessingShape" mc:Ignorable="w14 w15 w16se w16cid w16 w16cex w16sdtdh wp14">
+<w:hdr xmlns:wpc="http://schemas.microsoft.com/office/word/2010/wordprocessingCanvas" xmlns:cx="http://schemas.microsoft.com/office/drawing/2014/chartex" xmlns:cx1="http://schemas.microsoft.com/office/drawing/2015/9/8/chartex" xmlns:cx2="http://schemas.microsoft.com/office/drawing/2015/10/21/chartex" xmlns:cx3="http://schemas.microsoft.com/office/drawing/2016/5/9/chartex" xmlns:cx4="http://schemas.microsoft.com/office/drawing/2016/5/10/chartex" xmlns:cx5="http://schemas.microsoft.com/office/drawing/2016/5/11/chartex" xmlns:cx6="http://schemas.microsoft.com/office/drawing/2016/5/12/chartex" xmlns:cx7="http://schemas.microsoft.com/office/drawing/2016/5/13/chartex" xmlns:cx8="http://schemas.microsoft.com/office/drawing/2016/5/14/chartex" xmlns:mc="http://schemas.openxmlformats.org/markup-compatibility/2006" xmlns:aink="http://schemas.microsoft.com/office/drawing/2016/ink" xmlns:am3d="http://schemas.microsoft.com/office/drawing/2017/model3d" xmlns:o="urn:schemas-microsoft-com:office:office" xmlns:oel="http://schemas.microsoft.com/office/2019/extlst" xmlns:r="http://schemas.openxmlformats.org/officeDocument/2006/relationships" xmlns:m="http://schemas.openxmlformats.org/officeDocument/2006/math" xmlns:v="urn:schemas-microsoft-com:vml" xmlns:wp14="http://schemas.microsoft.com/office/word/2010/wordprocessingDrawing" xmlns:wp="http://schemas.openxmlformats.org/drawingml/2006/wordprocessingDrawing" xmlns:w10="urn:schemas-microsoft-com:office:word" xmlns:w="http://schemas.openxmlformats.org/wordprocessingml/2006/main" xmlns:w14="http://schemas.microsoft.com/office/word/2010/wordml" xmlns:w15="http://schemas.microsoft.com/office/word/2012/wordml" xmlns:w16cex="http://schemas.microsoft.com/office/word/2018/wordml/cex" xmlns:w16cid="http://schemas.microsoft.com/office/word/2016/wordml/cid" xmlns:w16="http://schemas.microsoft.com/office/word/2018/wordml" xmlns:w16sdtdh="http://schemas.microsoft.com/office/word/2020/wordml/sdtdatahash" xmlns:w16se="http://schemas.microsoft.com/office/word/2015/wordml/symex" xmlns:wpg="http://schemas.microsoft.com/office/word/2010/wordprocessingGroup" xmlns:wpi="http://schemas.microsoft.com/office/word/2010/wordprocessingInk" xmlns:wne="http://schemas.microsoft.com/office/word/2006/wordml" xmlns:wps="http://schemas.microsoft.com/office/word/2010/wordprocessingShape" mc:Ignorable="w14 w15 w16se w16cid w16 w16cex w16sdtdh wp14">
   <w:tbl>
     <w:tblPr>
       <w:tblW w:w="0" w:type="auto"/>
@@ -7450,7 +7424,6 @@
                 <w:docPartUnique/>
               </w:docPartObj>
             </w:sdtPr>
-            <w:sdtEndPr/>
             <w:sdtContent/>
           </w:sdt>
           <w:r>
@@ -7526,7 +7499,7 @@
 </file>
 
 <file path=word/numbering.xml><?xml version="1.0" encoding="utf-8"?>
-<w:numbering xmlns:wpc="http://schemas.microsoft.com/office/word/2010/wordprocessingCanvas" xmlns:cx="http://schemas.microsoft.com/office/drawing/2014/chartex" xmlns:cx1="http://schemas.microsoft.com/office/drawing/2015/9/8/chartex" xmlns:cx2="http://schemas.microsoft.com/office/drawing/2015/10/21/chartex" xmlns:cx3="http://schemas.microsoft.com/office/drawing/2016/5/9/chartex" xmlns:cx4="http://schemas.microsoft.com/office/drawing/2016/5/10/chartex" xmlns:cx5="http://schemas.microsoft.com/office/drawing/2016/5/11/chartex" xmlns:cx6="http://schemas.microsoft.com/office/drawing/2016/5/12/chartex" xmlns:cx7="http://schemas.microsoft.com/office/drawing/2016/5/13/chartex" xmlns:cx8="http://schemas.microsoft.com/office/drawing/2016/5/14/chartex" xmlns:mc="http://schemas.openxmlformats.org/markup-compatibility/2006" xmlns:aink="http://schemas.microsoft.com/office/drawing/2016/ink" xmlns:am3d="http://schemas.microsoft.com/office/drawing/2017/model3d" xmlns:o="urn:schemas-microsoft-com:office:office" xmlns:r="http://schemas.openxmlformats.org/officeDocument/2006/relationships" xmlns:m="http://schemas.openxmlformats.org/officeDocument/2006/math" xmlns:v="urn:schemas-microsoft-com:vml" xmlns:wp14="http://schemas.microsoft.com/office/word/2010/wordprocessingDrawing" xmlns:wp="http://schemas.openxmlformats.org/drawingml/2006/wordprocessingDrawing" xmlns:w10="urn:schemas-microsoft-com:office:word" xmlns:w="http://schemas.openxmlformats.org/wordprocessingml/2006/main" xmlns:w14="http://schemas.microsoft.com/office/word/2010/wordml" xmlns:w15="http://schemas.microsoft.com/office/word/2012/wordml" xmlns:w16cex="http://schemas.microsoft.com/office/word/2018/wordml/cex" xmlns:w16cid="http://schemas.microsoft.com/office/word/2016/wordml/cid" xmlns:w16="http://schemas.microsoft.com/office/word/2018/wordml" xmlns:w16sdtdh="http://schemas.microsoft.com/office/word/2020/wordml/sdtdatahash" xmlns:w16se="http://schemas.microsoft.com/office/word/2015/wordml/symex" xmlns:wpg="http://schemas.microsoft.com/office/word/2010/wordprocessingGroup" xmlns:wpi="http://schemas.microsoft.com/office/word/2010/wordprocessingInk" xmlns:wne="http://schemas.microsoft.com/office/word/2006/wordml" xmlns:wps="http://schemas.microsoft.com/office/word/2010/wordprocessingShape" mc:Ignorable="w14 w15 w16se w16cid w16 w16cex w16sdtdh wp14">
+<w:numbering xmlns:wpc="http://schemas.microsoft.com/office/word/2010/wordprocessingCanvas" xmlns:cx="http://schemas.microsoft.com/office/drawing/2014/chartex" xmlns:cx1="http://schemas.microsoft.com/office/drawing/2015/9/8/chartex" xmlns:cx2="http://schemas.microsoft.com/office/drawing/2015/10/21/chartex" xmlns:cx3="http://schemas.microsoft.com/office/drawing/2016/5/9/chartex" xmlns:cx4="http://schemas.microsoft.com/office/drawing/2016/5/10/chartex" xmlns:cx5="http://schemas.microsoft.com/office/drawing/2016/5/11/chartex" xmlns:cx6="http://schemas.microsoft.com/office/drawing/2016/5/12/chartex" xmlns:cx7="http://schemas.microsoft.com/office/drawing/2016/5/13/chartex" xmlns:cx8="http://schemas.microsoft.com/office/drawing/2016/5/14/chartex" xmlns:mc="http://schemas.openxmlformats.org/markup-compatibility/2006" xmlns:aink="http://schemas.microsoft.com/office/drawing/2016/ink" xmlns:am3d="http://schemas.microsoft.com/office/drawing/2017/model3d" xmlns:o="urn:schemas-microsoft-com:office:office" xmlns:oel="http://schemas.microsoft.com/office/2019/extlst" xmlns:r="http://schemas.openxmlformats.org/officeDocument/2006/relationships" xmlns:m="http://schemas.openxmlformats.org/officeDocument/2006/math" xmlns:v="urn:schemas-microsoft-com:vml" xmlns:wp14="http://schemas.microsoft.com/office/word/2010/wordprocessingDrawing" xmlns:wp="http://schemas.openxmlformats.org/drawingml/2006/wordprocessingDrawing" xmlns:w10="urn:schemas-microsoft-com:office:word" xmlns:w="http://schemas.openxmlformats.org/wordprocessingml/2006/main" xmlns:w14="http://schemas.microsoft.com/office/word/2010/wordml" xmlns:w15="http://schemas.microsoft.com/office/word/2012/wordml" xmlns:w16cex="http://schemas.microsoft.com/office/word/2018/wordml/cex" xmlns:w16cid="http://schemas.microsoft.com/office/word/2016/wordml/cid" xmlns:w16="http://schemas.microsoft.com/office/word/2018/wordml" xmlns:w16sdtdh="http://schemas.microsoft.com/office/word/2020/wordml/sdtdatahash" xmlns:w16se="http://schemas.microsoft.com/office/word/2015/wordml/symex" xmlns:wpg="http://schemas.microsoft.com/office/word/2010/wordprocessingGroup" xmlns:wpi="http://schemas.microsoft.com/office/word/2010/wordprocessingInk" xmlns:wne="http://schemas.microsoft.com/office/word/2006/wordml" xmlns:wps="http://schemas.microsoft.com/office/word/2010/wordprocessingShape" mc:Ignorable="w14 w15 w16se w16cid w16 w16cex w16sdtdh wp14">
   <w:abstractNum w:abstractNumId="0" w15:restartNumberingAfterBreak="0">
     <w:nsid w:val="02C4443C"/>
     <w:multiLevelType w:val="hybridMultilevel"/>
@@ -9956,139 +9929,139 @@
       </w:rPr>
     </w:lvl>
   </w:abstractNum>
-  <w:num w:numId="1">
+  <w:num w:numId="1" w16cid:durableId="1753040215">
     <w:abstractNumId w:val="12"/>
   </w:num>
-  <w:num w:numId="2">
+  <w:num w:numId="2" w16cid:durableId="1019818393">
     <w:abstractNumId w:val="12"/>
     <w:lvlOverride w:ilvl="0">
       <w:startOverride w:val="1"/>
     </w:lvlOverride>
   </w:num>
-  <w:num w:numId="3">
+  <w:num w:numId="3" w16cid:durableId="131142448">
     <w:abstractNumId w:val="11"/>
   </w:num>
-  <w:num w:numId="4">
+  <w:num w:numId="4" w16cid:durableId="1210651657">
     <w:abstractNumId w:val="13"/>
   </w:num>
-  <w:num w:numId="5">
+  <w:num w:numId="5" w16cid:durableId="603997597">
     <w:abstractNumId w:val="10"/>
   </w:num>
-  <w:num w:numId="6">
+  <w:num w:numId="6" w16cid:durableId="243882366">
     <w:abstractNumId w:val="0"/>
   </w:num>
-  <w:num w:numId="7">
+  <w:num w:numId="7" w16cid:durableId="1820419461">
     <w:abstractNumId w:val="18"/>
   </w:num>
-  <w:num w:numId="8">
+  <w:num w:numId="8" w16cid:durableId="1646859243">
     <w:abstractNumId w:val="9"/>
   </w:num>
-  <w:num w:numId="9">
+  <w:num w:numId="9" w16cid:durableId="1136488499">
     <w:abstractNumId w:val="5"/>
   </w:num>
-  <w:num w:numId="10">
+  <w:num w:numId="10" w16cid:durableId="1646617695">
     <w:abstractNumId w:val="14"/>
   </w:num>
-  <w:num w:numId="11">
+  <w:num w:numId="11" w16cid:durableId="465972501">
     <w:abstractNumId w:val="3"/>
   </w:num>
-  <w:num w:numId="12">
+  <w:num w:numId="12" w16cid:durableId="668872295">
     <w:abstractNumId w:val="8"/>
   </w:num>
-  <w:num w:numId="13">
+  <w:num w:numId="13" w16cid:durableId="191067591">
     <w:abstractNumId w:val="7"/>
   </w:num>
-  <w:num w:numId="14">
+  <w:num w:numId="14" w16cid:durableId="419329079">
     <w:abstractNumId w:val="19"/>
   </w:num>
-  <w:num w:numId="15">
+  <w:num w:numId="15" w16cid:durableId="35744369">
     <w:abstractNumId w:val="12"/>
     <w:lvlOverride w:ilvl="0">
       <w:startOverride w:val="1"/>
     </w:lvlOverride>
   </w:num>
-  <w:num w:numId="16">
+  <w:num w:numId="16" w16cid:durableId="2060934819">
     <w:abstractNumId w:val="12"/>
     <w:lvlOverride w:ilvl="0">
       <w:startOverride w:val="1"/>
     </w:lvlOverride>
   </w:num>
-  <w:num w:numId="17">
+  <w:num w:numId="17" w16cid:durableId="1760785318">
     <w:abstractNumId w:val="12"/>
   </w:num>
-  <w:num w:numId="18">
+  <w:num w:numId="18" w16cid:durableId="587234142">
     <w:abstractNumId w:val="12"/>
     <w:lvlOverride w:ilvl="0">
       <w:startOverride w:val="1"/>
     </w:lvlOverride>
   </w:num>
-  <w:num w:numId="19">
+  <w:num w:numId="19" w16cid:durableId="431362335">
     <w:abstractNumId w:val="12"/>
     <w:lvlOverride w:ilvl="0">
       <w:startOverride w:val="1"/>
     </w:lvlOverride>
   </w:num>
-  <w:num w:numId="20">
+  <w:num w:numId="20" w16cid:durableId="2105807313">
     <w:abstractNumId w:val="15"/>
   </w:num>
-  <w:num w:numId="21">
+  <w:num w:numId="21" w16cid:durableId="884759627">
     <w:abstractNumId w:val="6"/>
   </w:num>
-  <w:num w:numId="22">
+  <w:num w:numId="22" w16cid:durableId="2020086263">
     <w:abstractNumId w:val="16"/>
   </w:num>
-  <w:num w:numId="23">
+  <w:num w:numId="23" w16cid:durableId="1861552060">
     <w:abstractNumId w:val="20"/>
   </w:num>
-  <w:num w:numId="24">
+  <w:num w:numId="24" w16cid:durableId="344018985">
     <w:abstractNumId w:val="17"/>
   </w:num>
-  <w:num w:numId="25">
+  <w:num w:numId="25" w16cid:durableId="1204706571">
     <w:abstractNumId w:val="12"/>
     <w:lvlOverride w:ilvl="0">
       <w:startOverride w:val="1"/>
     </w:lvlOverride>
   </w:num>
-  <w:num w:numId="26">
+  <w:num w:numId="26" w16cid:durableId="1154372590">
     <w:abstractNumId w:val="12"/>
   </w:num>
-  <w:num w:numId="27">
+  <w:num w:numId="27" w16cid:durableId="18898309">
     <w:abstractNumId w:val="12"/>
   </w:num>
-  <w:num w:numId="28">
+  <w:num w:numId="28" w16cid:durableId="939723926">
     <w:abstractNumId w:val="4"/>
   </w:num>
-  <w:num w:numId="29">
+  <w:num w:numId="29" w16cid:durableId="1007558701">
     <w:abstractNumId w:val="12"/>
     <w:lvlOverride w:ilvl="0">
       <w:startOverride w:val="1"/>
     </w:lvlOverride>
   </w:num>
-  <w:num w:numId="30">
+  <w:num w:numId="30" w16cid:durableId="251159221">
     <w:abstractNumId w:val="1"/>
   </w:num>
-  <w:num w:numId="31">
+  <w:num w:numId="31" w16cid:durableId="1840728983">
     <w:abstractNumId w:val="2"/>
   </w:num>
-  <w:num w:numId="32">
+  <w:num w:numId="32" w16cid:durableId="1571845963">
     <w:abstractNumId w:val="12"/>
     <w:lvlOverride w:ilvl="0">
       <w:startOverride w:val="1"/>
     </w:lvlOverride>
   </w:num>
-  <w:num w:numId="33">
+  <w:num w:numId="33" w16cid:durableId="213664640">
     <w:abstractNumId w:val="12"/>
   </w:num>
-  <w:num w:numId="34">
+  <w:num w:numId="34" w16cid:durableId="993528819">
     <w:abstractNumId w:val="12"/>
   </w:num>
-  <w:num w:numId="35">
+  <w:num w:numId="35" w16cid:durableId="289168791">
     <w:abstractNumId w:val="12"/>
   </w:num>
-  <w:num w:numId="36">
+  <w:num w:numId="36" w16cid:durableId="697203117">
     <w:abstractNumId w:val="12"/>
   </w:num>
-  <w:num w:numId="37">
+  <w:num w:numId="37" w16cid:durableId="396900434">
     <w:abstractNumId w:val="12"/>
   </w:num>
   <w:numIdMacAtCleanup w:val="5"/>

</xml_diff>